<commit_message>
fix(week1): resolve markdown table underscore emphasis, heading spacing, and mermaid syntax
</commit_message>
<xml_diff>
--- a/Resources/WEEK_1_PART_A_USER_PERSONAS.docx
+++ b/Resources/WEEK_1_PART_A_USER_PERSONAS.docx
@@ -4759,7 +4759,16 @@
                 <w:sz w:val="22"/>
                 <w:szCs w:val="22"/>
               </w:rPr>
-              <w:t xml:space="preserve"> — Signature: ___________________</w:t>
+              <w:t xml:space="preserve"> — Signature: </w:t>
+            </w:r>
+            <w:r>
+              <w:rPr>
+                <w:rFonts w:ascii="Times New Roman" w:hAnsi="Times New Roman" w:cs="Times New Roman" w:eastAsia="Times New Roman"/>
+                <w:color w:val="000000"/>
+                <w:sz w:val="22"/>
+                <w:szCs w:val="22"/>
+              </w:rPr>
+              <w:t xml:space="preserve">[__________________]</w:t>
             </w:r>
           </w:p>
         </w:tc>
@@ -4785,7 +4794,7 @@
                 <w:sz w:val="22"/>
                 <w:szCs w:val="22"/>
               </w:rPr>
-              <w:t xml:space="preserve">____________</w:t>
+              <w:t xml:space="preserve">[____________]</w:t>
             </w:r>
           </w:p>
         </w:tc>

</xml_diff>

<commit_message>
docs(srs): upgrade to Revision 2.6 resolving all 7 pre-freeze audit findings and synchronizing diagrams
</commit_message>
<xml_diff>
--- a/Resources/WEEK_1_PART_A_USER_PERSONAS.docx
+++ b/Resources/WEEK_1_PART_A_USER_PERSONAS.docx
@@ -721,7 +721,7 @@
                 <w:sz w:val="22"/>
                 <w:szCs w:val="22"/>
               </w:rPr>
-              <w:t xml:space="preserve">Week 1 (Part A): Discovery Interviews, Friction Taxonomy &amp; User Personas</w:t>
+              <w:t xml:space="preserve">Week 1 (Part A): Secondary Research, Friction Taxonomy &amp; Provisional Composite Personas</w:t>
             </w:r>
           </w:p>
         </w:tc>
@@ -804,7 +804,7 @@
           <w:sz w:val="24"/>
           <w:szCs w:val="24"/>
         </w:rPr>
-        <w:t xml:space="preserve">Server-Managed Plaintext Exposure</w:t>
+        <w:t xml:space="preserve">Provider-Managed Key Control</w:t>
       </w:r>
       <w:r>
         <w:rPr>
@@ -813,7 +813,7 @@
           <w:sz w:val="24"/>
           <w:szCs w:val="24"/>
         </w:rPr>
-        <w:t xml:space="preserve">: Free and commercial tiers of traditional VDP platforms operate on a server-managed model where exploit descriptions and proof-of-concept (PoC) attachments are stored in plaintext on vendor infrastructure, accessible to platform operators, cloud intermediaries, and support databases.</w:t>
+        <w:t xml:space="preserve">: Free and commercial tiers of traditional VDP platforms operate on a provider-managed encryption model where the third-party platform vendor holds the decryption keys and can access submitted exploit descriptions and proof-of-concept (PoC) attachments on server infrastructure, rather than enforcing client-side end-to-end encryption (E2EE).</w:t>
       </w:r>
     </w:p>
     <w:p xmlns:w="http://schemas.openxmlformats.org/wordprocessingml/2006/main">
@@ -883,7 +883,7 @@
           <w:sz w:val="24"/>
           <w:szCs w:val="24"/>
         </w:rPr>
-        <w:t xml:space="preserve">: Organizations unwilling to store unpatched zero-day exploits in plaintext on third-party vendor servers fall back to generic </w:t>
+        <w:t xml:space="preserve">: Organizations unwilling to delegate zero-day exploit visibility to third-party platform operators fall back to generic </w:t>
       </w:r>
       <w:r>
         <w:rPr>
@@ -901,7 +901,7 @@
           <w:sz w:val="24"/>
           <w:szCs w:val="24"/>
         </w:rPr>
-        <w:t xml:space="preserve"> email inboxes or standard issue trackers (Jira, Linear), exposing sensitive exploit steps over unencrypted email servers and closing security tickets via informal text status updates without Git commit verification or researcher retesting.</w:t>
+        <w:t xml:space="preserve"> email inboxes or standard issue trackers (Jira, Linear), where—unless senders manually configure PGP—sensitive exploit steps traverse mail servers without end-to-end encryption and security tickets are closed via informal text status updates without Git commit verification or researcher retesting.</w:t>
       </w:r>
     </w:p>
     <w:p xmlns:w="http://schemas.openxmlformats.org/wordprocessingml/2006/main">
@@ -919,7 +919,7 @@
           <w:sz w:val="28"/>
           <w:szCs w:val="28"/>
         </w:rPr>
-        <w:t xml:space="preserve">3. Target User Interviews &amp; 4 Operational Frictions Identified</w:t>
+        <w:t xml:space="preserve">3. Secondary Research, Workflow Modeling &amp; 4 Operational Frictions Identified</w:t>
       </w:r>
     </w:p>
     <w:p xmlns:w="http://schemas.openxmlformats.org/wordprocessingml/2006/main">
@@ -934,7 +934,148 @@
           <w:sz w:val="24"/>
           <w:szCs w:val="24"/>
         </w:rPr>
-        <w:t xml:space="preserve">Structured discovery interviews representing both sides of the disclosure workflow—independent ethical security researchers ("Hunters") and startup engineering leads ("Defenders")—revealed four primary operational frictions:</w:t>
+        <w:t xml:space="preserve">Secondary industry research, public vulnerability disclosure post-mortems, and standards-based workflow modeling (ISO/IEC 29147, ISO/IEC 30111, RFC 9116, RFC 9580, FIRST.org CVSS v3.1) across both sides of the disclosure workflow—independent ethical security researchers ("Hunters") and startup engineering leads ("Defenders")—identified four primary operational frictions:</w:t>
+      </w:r>
+    </w:p>
+    <w:p xmlns:w="http://schemas.openxmlformats.org/wordprocessingml/2006/main">
+      <w:pPr>
+        <w:ind w:left="360"/>
+        <w:spacing w:before="100" w:after="100" w:line="276" w:lineRule="auto"/>
+        <w:jc w:val="both"/>
+      </w:pPr>
+      <w:r>
+        <w:rPr>
+          <w:rFonts w:ascii="Times New Roman" w:hAnsi="Times New Roman" w:cs="Times New Roman" w:eastAsia="Times New Roman"/>
+          <w:b/>
+          <w:bCs/>
+          <w:color w:val="000000"/>
+          <w:sz w:val="24"/>
+          <w:szCs w:val="24"/>
+        </w:rPr>
+        <w:t xml:space="preserve">Methodological &amp; Empirical Separation Note</w:t>
+      </w:r>
+      <w:r>
+        <w:rPr>
+          <w:rFonts w:ascii="Times New Roman" w:hAnsi="Times New Roman" w:cs="Times New Roman" w:eastAsia="Times New Roman"/>
+          <w:color w:val="000000"/>
+          <w:sz w:val="24"/>
+          <w:szCs w:val="24"/>
+        </w:rPr>
+        <w:t xml:space="preserve">: No live external target-user interview transcripts were completed prior to this baseline. The friction taxonomy (</w:t>
+      </w:r>
+      <w:r>
+        <w:rPr>
+          <w:rFonts w:ascii="Times New Roman" w:hAnsi="Times New Roman" w:cs="Times New Roman" w:eastAsia="Times New Roman"/>
+          <w:color w:val="000000"/>
+          <w:sz w:val="24"/>
+          <w:szCs w:val="24"/>
+        </w:rPr>
+        <w:t xml:space="preserve">FRC-01</w:t>
+      </w:r>
+      <w:r>
+        <w:rPr>
+          <w:rFonts w:ascii="Times New Roman" w:hAnsi="Times New Roman" w:cs="Times New Roman" w:eastAsia="Times New Roman"/>
+          <w:color w:val="000000"/>
+          <w:sz w:val="24"/>
+          <w:szCs w:val="24"/>
+        </w:rPr>
+        <w:t xml:space="preserve">–</w:t>
+      </w:r>
+      <w:r>
+        <w:rPr>
+          <w:rFonts w:ascii="Times New Roman" w:hAnsi="Times New Roman" w:cs="Times New Roman" w:eastAsia="Times New Roman"/>
+          <w:color w:val="000000"/>
+          <w:sz w:val="24"/>
+          <w:szCs w:val="24"/>
+        </w:rPr>
+        <w:t xml:space="preserve">FRC-04</w:t>
+      </w:r>
+      <w:r>
+        <w:rPr>
+          <w:rFonts w:ascii="Times New Roman" w:hAnsi="Times New Roman" w:cs="Times New Roman" w:eastAsia="Times New Roman"/>
+          <w:color w:val="000000"/>
+          <w:sz w:val="24"/>
+          <w:szCs w:val="24"/>
+        </w:rPr>
+        <w:t xml:space="preserve">) and the two personas in Section 4 (</w:t>
+      </w:r>
+      <w:r>
+        <w:rPr>
+          <w:rFonts w:ascii="Times New Roman" w:hAnsi="Times New Roman" w:cs="Times New Roman" w:eastAsia="Times New Roman"/>
+          <w:b/>
+          <w:bCs/>
+          <w:color w:val="000000"/>
+          <w:sz w:val="24"/>
+          <w:szCs w:val="24"/>
+        </w:rPr>
+        <w:t xml:space="preserve">Alex Rivera</w:t>
+      </w:r>
+      <w:r>
+        <w:rPr>
+          <w:rFonts w:ascii="Times New Roman" w:hAnsi="Times New Roman" w:cs="Times New Roman" w:eastAsia="Times New Roman"/>
+          <w:color w:val="000000"/>
+          <w:sz w:val="24"/>
+          <w:szCs w:val="24"/>
+        </w:rPr>
+        <w:t xml:space="preserve"> and </w:t>
+      </w:r>
+      <w:r>
+        <w:rPr>
+          <w:rFonts w:ascii="Times New Roman" w:hAnsi="Times New Roman" w:cs="Times New Roman" w:eastAsia="Times New Roman"/>
+          <w:b/>
+          <w:bCs/>
+          <w:color w:val="000000"/>
+          <w:sz w:val="24"/>
+          <w:szCs w:val="24"/>
+        </w:rPr>
+        <w:t xml:space="preserve">Sarah Chen</w:t>
+      </w:r>
+      <w:r>
+        <w:rPr>
+          <w:rFonts w:ascii="Times New Roman" w:hAnsi="Times New Roman" w:cs="Times New Roman" w:eastAsia="Times New Roman"/>
+          <w:color w:val="000000"/>
+          <w:sz w:val="24"/>
+          <w:szCs w:val="24"/>
+        </w:rPr>
+        <w:t xml:space="preserve">) are explicitly documented as </w:t>
+      </w:r>
+      <w:r>
+        <w:rPr>
+          <w:rFonts w:ascii="Times New Roman" w:hAnsi="Times New Roman" w:cs="Times New Roman" w:eastAsia="Times New Roman"/>
+          <w:b/>
+          <w:bCs/>
+          <w:color w:val="000000"/>
+          <w:sz w:val="24"/>
+          <w:szCs w:val="24"/>
+        </w:rPr>
+        <w:t xml:space="preserve">secondary research and workflow modeling constructs (Provisional Composite Personas)</w:t>
+      </w:r>
+      <w:r>
+        <w:rPr>
+          <w:rFonts w:ascii="Times New Roman" w:hAnsi="Times New Roman" w:cs="Times New Roman" w:eastAsia="Times New Roman"/>
+          <w:color w:val="000000"/>
+          <w:sz w:val="24"/>
+          <w:szCs w:val="24"/>
+        </w:rPr>
+        <w:t xml:space="preserve">. Because the original Week 1 assignment specifies target-user interviews—and later Phase 4 peer usability testing (</w:t>
+      </w:r>
+      <w:r>
+        <w:rPr>
+          <w:rFonts w:ascii="Times New Roman" w:hAnsi="Times New Roman" w:cs="Times New Roman" w:eastAsia="Times New Roman"/>
+          <w:color w:val="000000"/>
+          <w:sz w:val="24"/>
+          <w:szCs w:val="24"/>
+        </w:rPr>
+        <w:t xml:space="preserve">SUS</w:t>
+      </w:r>
+      <w:r>
+        <w:rPr>
+          <w:rFonts w:ascii="Times New Roman" w:hAnsi="Times New Roman" w:cs="Times New Roman" w:eastAsia="Times New Roman"/>
+          <w:color w:val="000000"/>
+          <w:sz w:val="24"/>
+          <w:szCs w:val="24"/>
+        </w:rPr>
+        <w:t xml:space="preserve">) does not substitute for earlier target-user discovery interviews—live target-user interview sessions are tracked as a separate empirical validation item and will be recorded in a dedicated Empirical Interview Log when completed, keeping actual interview findings strictly distinct from modeling assumptions.</w:t>
       </w:r>
     </w:p>
     <w:tbl xmlns:w="http://schemas.openxmlformats.org/wordprocessingml/2006/main">
@@ -1155,7 +1296,7 @@
                 <w:sz w:val="22"/>
                 <w:szCs w:val="22"/>
               </w:rPr>
-              <w:t xml:space="preserve">Third-Party Plaintext Exposure</w:t>
+              <w:t xml:space="preserve">Provider-Managed Encryption</w:t>
             </w:r>
           </w:p>
         </w:tc>
@@ -1181,7 +1322,7 @@
                 <w:sz w:val="22"/>
                 <w:szCs w:val="22"/>
               </w:rPr>
-              <w:t xml:space="preserve">Existing VDP tiers store raw exploit write-ups and PoC scripts in server-readable plaintext on vendor databases.</w:t>
+              <w:t xml:space="preserve">Existing VDP tiers rely on provider-managed encryption where the platform vendor holds the decryption keys.</w:t>
             </w:r>
           </w:p>
         </w:tc>
@@ -1207,7 +1348,7 @@
                 <w:sz w:val="22"/>
                 <w:szCs w:val="22"/>
               </w:rPr>
-              <w:t xml:space="preserve">A vendor breach or unauthorized third-party access exposes active, unpatched zero-day exploits across tenant organizations.</w:t>
+              <w:t xml:space="preserve">A vendor compromise or unauthorized third-party access exposes active, unpatched zero-day exploits across tenant organizations.</w:t>
             </w:r>
           </w:p>
         </w:tc>
@@ -1415,7 +1556,7 @@
                 <w:sz w:val="22"/>
                 <w:szCs w:val="22"/>
               </w:rPr>
-              <w:t xml:space="preserve">Standard SMTP lacks end-to-end encryption; raw SQLi/RCE payloads sit in plaintext across mail relays, shared inboxes, and Slack threads.</w:t>
+              <w:t xml:space="preserve">Unless senders manually configure PGP, standard SMTP lacks mandatory E2EE; raw SQLi/RCE payloads sit readable across mail relays and shared inboxes.</w:t>
             </w:r>
           </w:p>
         </w:tc>
@@ -1579,7 +1720,7 @@
                 <w:sz w:val="22"/>
                 <w:szCs w:val="22"/>
               </w:rPr>
-              <w:t xml:space="preserve"> Safe Harbor policies, and portals demand full account signup for one-off reports.</w:t>
+              <w:t xml:space="preserve"> discovery files linking to Safe Harbor terms, and portals demand full account signup for one-off reports.</w:t>
             </w:r>
           </w:p>
         </w:tc>
@@ -1649,7 +1790,7 @@
                 <w:sz w:val="22"/>
                 <w:szCs w:val="22"/>
               </w:rPr>
-              <w:t xml:space="preserve"> with Disclose.io Safe Harbor terms, plus 60-second Account-Less Guest Intake with </w:t>
+              <w:t xml:space="preserve"> linking to hosted Disclose.io Safe Harbor terms, plus 60-second Account-Less Guest Intake with </w:t>
             </w:r>
             <w:r>
               <w:rPr>
@@ -1830,7 +1971,7 @@
           <w:sz w:val="28"/>
           <w:szCs w:val="28"/>
         </w:rPr>
-        <w:t xml:space="preserve">4. Detailed Target User Personas &amp; Empathy Maps</w:t>
+        <w:t xml:space="preserve">4. Provisional Composite Target User Personas &amp; Empathy Maps</w:t>
       </w:r>
     </w:p>
     <w:p xmlns:w="http://schemas.openxmlformats.org/wordprocessingml/2006/main">
@@ -1848,7 +1989,7 @@
           <w:sz w:val="26"/>
           <w:szCs w:val="26"/>
         </w:rPr>
-        <w:t xml:space="preserve">4.1 Persona 1: Alex Rivera — "The Hunter" (External Ethical Security Researcher)</w:t>
+        <w:t xml:space="preserve">4.1 Persona 1: Alex Rivera — "The Hunter" (Provisional Composite: External Ethical Security Researcher)</w:t>
       </w:r>
     </w:p>
     <w:tbl xmlns:w="http://schemas.openxmlformats.org/wordprocessingml/2006/main">

</xml_diff>

<commit_message>
docs(srs): upgrade to Revision 2.7 (atomic savepoint pause, logical vs 53100 quota handling, 11s/15s cron budget, DISCOVERY_INTERVIEW_LOG.md)
</commit_message>
<xml_diff>
--- a/Resources/WEEK_1_PART_A_USER_PERSONAS.docx
+++ b/Resources/WEEK_1_PART_A_USER_PERSONAS.docx
@@ -1075,7 +1075,61 @@
           <w:sz w:val="24"/>
           <w:szCs w:val="24"/>
         </w:rPr>
-        <w:t xml:space="preserve">) does not substitute for earlier target-user discovery interviews—live target-user interview sessions are tracked as a separate empirical validation item and will be recorded in a dedicated Empirical Interview Log when completed, keeping actual interview findings strictly distinct from modeling assumptions.</w:t>
+        <w:t xml:space="preserve">) does not substitute for earlier target-user discovery interviews—live target-user interview sessions are tracked as a separate empirical validation item in the repository's Empirical Interview Log (</w:t>
+      </w:r>
+      <w:r>
+        <w:rPr>
+          <w:rFonts w:ascii="Times New Roman" w:hAnsi="Times New Roman" w:cs="Times New Roman" w:eastAsia="Times New Roman"/>
+          <w:color w:val="000000"/>
+          <w:sz w:val="24"/>
+          <w:szCs w:val="24"/>
+        </w:rPr>
+        <w:t xml:space="preserve">DISCOVERY_INTERVIEW_LOG.md</w:t>
+      </w:r>
+      <w:r>
+        <w:rPr>
+          <w:rFonts w:ascii="Times New Roman" w:hAnsi="Times New Roman" w:cs="Times New Roman" w:eastAsia="Times New Roman"/>
+          <w:color w:val="000000"/>
+          <w:sz w:val="24"/>
+          <w:szCs w:val="24"/>
+        </w:rPr>
+        <w:t xml:space="preserve">, currently </w:t>
+      </w:r>
+      <w:r>
+        <w:rPr>
+          <w:rFonts w:ascii="Times New Roman" w:hAnsi="Times New Roman" w:cs="Times New Roman" w:eastAsia="Times New Roman"/>
+          <w:color w:val="000000"/>
+          <w:sz w:val="24"/>
+          <w:szCs w:val="24"/>
+        </w:rPr>
+        <w:t xml:space="preserve">PENDING_LIVE_INTERVIEWS</w:t>
+      </w:r>
+      <w:r>
+        <w:rPr>
+          <w:rFonts w:ascii="Times New Roman" w:hAnsi="Times New Roman" w:cs="Times New Roman" w:eastAsia="Times New Roman"/>
+          <w:color w:val="000000"/>
+          <w:sz w:val="24"/>
+          <w:szCs w:val="24"/>
+        </w:rPr>
+        <w:t xml:space="preserve"> with </w:t>
+      </w:r>
+      <w:r>
+        <w:rPr>
+          <w:rFonts w:ascii="Times New Roman" w:hAnsi="Times New Roman" w:cs="Times New Roman" w:eastAsia="Times New Roman"/>
+          <w:color w:val="000000"/>
+          <w:sz w:val="24"/>
+          <w:szCs w:val="24"/>
+        </w:rPr>
+        <w:t xml:space="preserve">0</w:t>
+      </w:r>
+      <w:r>
+        <w:rPr>
+          <w:rFonts w:ascii="Times New Roman" w:hAnsi="Times New Roman" w:cs="Times New Roman" w:eastAsia="Times New Roman"/>
+          <w:color w:val="000000"/>
+          <w:sz w:val="24"/>
+          <w:szCs w:val="24"/>
+        </w:rPr>
+        <w:t xml:space="preserve"> completed sessions), keeping actual interview findings strictly distinct from modeling assumptions.</w:t>
       </w:r>
     </w:p>
     <w:tbl xmlns:w="http://schemas.openxmlformats.org/wordprocessingml/2006/main">

</xml_diff>